<commit_message>
Ajout chapitre 4 5ème
</commit_message>
<xml_diff>
--- a/Cours/5eme/SaintExupery/Chapitre_4/Documents/Chapitre 4 - Angles particuliers (A trou).docx
+++ b/Cours/5eme/SaintExupery/Chapitre_4/Documents/Chapitre 4 - Angles particuliers (A trou).docx
@@ -1772,6 +1772,514 @@
       <w:pPr>
         <w:pStyle w:val="Titre1"/>
       </w:pPr>
+      <w:r>
+        <w:t>I</w:t>
+      </w:r>
+      <w:r>
+        <w:t>I</w:t>
+      </w:r>
+      <w:r>
+        <w:t xml:space="preserve"> – </w:t>
+      </w:r>
+      <w:r>
+        <w:t>Mesure et construction</w:t>
+      </w:r>
+      <w:r>
+        <w:rPr>
+          <w:rFonts w:ascii="Times New Roman" w:hAnsi="Times New Roman"/>
+        </w:rPr>
+        <w:t xml:space="preserve"> </w:t>
+      </w:r>
+      <w:r>
+        <w:t>:</w:t>
+      </w:r>
+    </w:p>
+    <w:p>
+      <w:pPr>
+        <w:pStyle w:val="Titre2"/>
+        <w:numPr>
+          <w:ilvl w:val="0"/>
+          <w:numId w:val="15"/>
+        </w:numPr>
+      </w:pPr>
+      <w:r>
+        <w:t>Mesure d’un angle :</w:t>
+      </w:r>
+    </w:p>
+    <w:p>
+      <w:pPr>
+        <w:spacing w:before="100" w:beforeAutospacing="1" w:after="100" w:afterAutospacing="1" w:line="240" w:lineRule="auto"/>
+      </w:pPr>
+      <w:r>
+        <w:t>Lorsque l'on souhaite mesure un angle, on place le centre du rapporteur sur le sommet de l'angle ; On aligne l'un des 0° avec l'un des côtés de l'angle et on mesure à partir de la position de la seconde demi-droite.</w:t>
+      </w:r>
+    </w:p>
+    <w:tbl>
+      <w:tblPr>
+        <w:tblStyle w:val="Grilledutableau"/>
+        <w:tblW w:w="0" w:type="auto"/>
+        <w:tblLook w:val="04A0" w:firstRow="1" w:lastRow="0" w:firstColumn="1" w:lastColumn="0" w:noHBand="0" w:noVBand="1"/>
+      </w:tblPr>
+      <w:tblGrid>
+        <w:gridCol w:w="4956"/>
+        <w:gridCol w:w="4957"/>
+      </w:tblGrid>
+      <w:tr>
+        <w:tc>
+          <w:tcPr>
+            <w:tcW w:w="4956" w:type="dxa"/>
+          </w:tcPr>
+          <w:p>
+            <w:pPr>
+              <w:spacing w:before="100" w:beforeAutospacing="1" w:after="100" w:afterAutospacing="1"/>
+              <w:rPr>
+                <w:sz w:val="24"/>
+                <w:szCs w:val="24"/>
+              </w:rPr>
+            </w:pPr>
+            <w:r>
+              <w:rPr>
+                <w:noProof/>
+                <w:sz w:val="24"/>
+                <w:szCs w:val="24"/>
+              </w:rPr>
+              <w:drawing>
+                <wp:inline distT="0" distB="0" distL="0" distR="0" wp14:anchorId="75A789BB" wp14:editId="375BBACD">
+                  <wp:extent cx="3060000" cy="2108800"/>
+                  <wp:effectExtent l="0" t="0" r="7620" b="6350"/>
+                  <wp:docPr id="38" name="Graphique 38"/>
+                  <wp:cNvGraphicFramePr>
+                    <a:graphicFrameLocks xmlns:a="http://schemas.openxmlformats.org/drawingml/2006/main" noChangeAspect="1"/>
+                  </wp:cNvGraphicFramePr>
+                  <a:graphic xmlns:a="http://schemas.openxmlformats.org/drawingml/2006/main">
+                    <a:graphicData uri="http://schemas.openxmlformats.org/drawingml/2006/picture">
+                      <pic:pic xmlns:pic="http://schemas.openxmlformats.org/drawingml/2006/picture">
+                        <pic:nvPicPr>
+                          <pic:cNvPr id="1" name=""/>
+                          <pic:cNvPicPr/>
+                        </pic:nvPicPr>
+                        <pic:blipFill>
+                          <a:blip r:embed="rId26">
+                            <a:extLst>
+                              <a:ext uri="{96DAC541-7B7A-43D3-8B79-37D633B846F1}">
+                                <asvg:svgBlip xmlns:asvg="http://schemas.microsoft.com/office/drawing/2016/SVG/main" r:embed="rId27"/>
+                              </a:ext>
+                            </a:extLst>
+                          </a:blip>
+                          <a:stretch>
+                            <a:fillRect/>
+                          </a:stretch>
+                        </pic:blipFill>
+                        <pic:spPr>
+                          <a:xfrm>
+                            <a:off x="0" y="0"/>
+                            <a:ext cx="3060000" cy="2108800"/>
+                          </a:xfrm>
+                          <a:prstGeom prst="rect">
+                            <a:avLst/>
+                          </a:prstGeom>
+                        </pic:spPr>
+                      </pic:pic>
+                    </a:graphicData>
+                  </a:graphic>
+                </wp:inline>
+              </w:drawing>
+            </w:r>
+          </w:p>
+        </w:tc>
+        <w:tc>
+          <w:tcPr>
+            <w:tcW w:w="4957" w:type="dxa"/>
+          </w:tcPr>
+          <w:p>
+            <w:pPr>
+              <w:spacing w:before="100" w:beforeAutospacing="1" w:after="100" w:afterAutospacing="1"/>
+              <w:rPr>
+                <w:sz w:val="24"/>
+                <w:szCs w:val="24"/>
+              </w:rPr>
+            </w:pPr>
+            <w:r>
+              <w:rPr>
+                <w:rFonts w:eastAsia="Times New Roman" w:cs="Times New Roman"/>
+                <w:noProof/>
+                <w:sz w:val="28"/>
+                <w:szCs w:val="28"/>
+                <w:lang w:eastAsia="fr-FR"/>
+              </w:rPr>
+              <w:drawing>
+                <wp:inline distT="0" distB="0" distL="0" distR="0" wp14:anchorId="551A2BA7" wp14:editId="6809960F">
+                  <wp:extent cx="3060000" cy="1803695"/>
+                  <wp:effectExtent l="0" t="0" r="7620" b="6350"/>
+                  <wp:docPr id="39" name="Graphique 39"/>
+                  <wp:cNvGraphicFramePr>
+                    <a:graphicFrameLocks xmlns:a="http://schemas.openxmlformats.org/drawingml/2006/main" noChangeAspect="1"/>
+                  </wp:cNvGraphicFramePr>
+                  <a:graphic xmlns:a="http://schemas.openxmlformats.org/drawingml/2006/main">
+                    <a:graphicData uri="http://schemas.openxmlformats.org/drawingml/2006/picture">
+                      <pic:pic xmlns:pic="http://schemas.openxmlformats.org/drawingml/2006/picture">
+                        <pic:nvPicPr>
+                          <pic:cNvPr id="1" name=""/>
+                          <pic:cNvPicPr/>
+                        </pic:nvPicPr>
+                        <pic:blipFill>
+                          <a:blip r:embed="rId28">
+                            <a:extLst>
+                              <a:ext uri="{96DAC541-7B7A-43D3-8B79-37D633B846F1}">
+                                <asvg:svgBlip xmlns:asvg="http://schemas.microsoft.com/office/drawing/2016/SVG/main" r:embed="rId29"/>
+                              </a:ext>
+                            </a:extLst>
+                          </a:blip>
+                          <a:stretch>
+                            <a:fillRect/>
+                          </a:stretch>
+                        </pic:blipFill>
+                        <pic:spPr>
+                          <a:xfrm>
+                            <a:off x="0" y="0"/>
+                            <a:ext cx="3060000" cy="1803695"/>
+                          </a:xfrm>
+                          <a:prstGeom prst="rect">
+                            <a:avLst/>
+                          </a:prstGeom>
+                        </pic:spPr>
+                      </pic:pic>
+                    </a:graphicData>
+                  </a:graphic>
+                </wp:inline>
+              </w:drawing>
+            </w:r>
+          </w:p>
+        </w:tc>
+      </w:tr>
+    </w:tbl>
+    <w:p>
+      <w:pPr>
+        <w:spacing w:before="100" w:beforeAutospacing="1" w:after="100" w:afterAutospacing="1" w:line="240" w:lineRule="auto"/>
+        <w:rPr>
+          <w:sz w:val="24"/>
+          <w:szCs w:val="24"/>
+        </w:rPr>
+      </w:pPr>
+      <w:r>
+        <w:t>En fonction du 0° choisi, la mesure de l'angle se mesure avec les graduations à l'intérieur ou à l'extérieur du rapporteur.</w:t>
+      </w:r>
+    </w:p>
+    <w:p>
+      <w:pPr>
+        <w:pStyle w:val="Titre2"/>
+      </w:pPr>
+      <w:r>
+        <w:lastRenderedPageBreak/>
+        <w:t>Construction d’un angle :</w:t>
+      </w:r>
+    </w:p>
+    <w:tbl>
+      <w:tblPr>
+        <w:tblStyle w:val="Grilledutableau"/>
+        <w:tblW w:w="0" w:type="auto"/>
+        <w:tblLook w:val="04A0" w:firstRow="1" w:lastRow="0" w:firstColumn="1" w:lastColumn="0" w:noHBand="0" w:noVBand="1"/>
+      </w:tblPr>
+      <w:tblGrid>
+        <w:gridCol w:w="4954"/>
+        <w:gridCol w:w="4923"/>
+      </w:tblGrid>
+      <w:tr>
+        <w:tc>
+          <w:tcPr>
+            <w:tcW w:w="4956" w:type="dxa"/>
+            <w:tcBorders>
+              <w:top w:val="single" w:sz="18" w:space="0" w:color="auto"/>
+              <w:left w:val="single" w:sz="18" w:space="0" w:color="auto"/>
+              <w:right w:val="single" w:sz="18" w:space="0" w:color="auto"/>
+            </w:tcBorders>
+          </w:tcPr>
+          <w:p>
+            <w:pPr>
+              <w:pStyle w:val="Paragraphedeliste"/>
+              <w:numPr>
+                <w:ilvl w:val="0"/>
+                <w:numId w:val="25"/>
+              </w:numPr>
+              <w:spacing w:before="100" w:beforeAutospacing="1"/>
+              <w:ind w:left="449"/>
+              <w:rPr>
+                <w:sz w:val="24"/>
+                <w:szCs w:val="24"/>
+              </w:rPr>
+            </w:pPr>
+            <w:r>
+              <w:t>On place le rapporteur sur le sommet.</w:t>
+            </w:r>
+          </w:p>
+        </w:tc>
+        <w:tc>
+          <w:tcPr>
+            <w:tcW w:w="4957" w:type="dxa"/>
+            <w:tcBorders>
+              <w:top w:val="single" w:sz="18" w:space="0" w:color="auto"/>
+              <w:left w:val="single" w:sz="18" w:space="0" w:color="auto"/>
+              <w:right w:val="single" w:sz="18" w:space="0" w:color="auto"/>
+            </w:tcBorders>
+          </w:tcPr>
+          <w:p>
+            <w:pPr>
+              <w:pStyle w:val="Paragraphedeliste"/>
+              <w:numPr>
+                <w:ilvl w:val="0"/>
+                <w:numId w:val="25"/>
+              </w:numPr>
+              <w:spacing w:before="100" w:beforeAutospacing="1"/>
+              <w:ind w:left="458"/>
+              <w:rPr>
+                <w:sz w:val="24"/>
+                <w:szCs w:val="24"/>
+              </w:rPr>
+            </w:pPr>
+            <w:r>
+              <w:t>On aligne le rapporteur avec la demi-droite et on mesure 70° à partir du 0° aligné avec la demi-droite.</w:t>
+            </w:r>
+          </w:p>
+        </w:tc>
+      </w:tr>
+      <w:tr>
+        <w:trPr>
+          <w:trHeight w:val="3005"/>
+        </w:trPr>
+        <w:tc>
+          <w:tcPr>
+            <w:tcW w:w="4956" w:type="dxa"/>
+            <w:tcBorders>
+              <w:left w:val="single" w:sz="18" w:space="0" w:color="auto"/>
+              <w:bottom w:val="single" w:sz="18" w:space="0" w:color="auto"/>
+              <w:right w:val="single" w:sz="18" w:space="0" w:color="auto"/>
+            </w:tcBorders>
+            <w:vAlign w:val="center"/>
+          </w:tcPr>
+          <w:p>
+            <w:pPr>
+              <w:jc w:val="center"/>
+            </w:pPr>
+            <w:r>
+              <w:rPr>
+                <w:noProof/>
+                <w:sz w:val="24"/>
+                <w:szCs w:val="24"/>
+              </w:rPr>
+              <w:drawing>
+                <wp:inline distT="0" distB="0" distL="0" distR="0" wp14:anchorId="52CEA8F8" wp14:editId="5D352508">
+                  <wp:extent cx="2988000" cy="1571850"/>
+                  <wp:effectExtent l="0" t="0" r="3175" b="9525"/>
+                  <wp:docPr id="41" name="Graphique 41"/>
+                  <wp:cNvGraphicFramePr>
+                    <a:graphicFrameLocks xmlns:a="http://schemas.openxmlformats.org/drawingml/2006/main" noChangeAspect="1"/>
+                  </wp:cNvGraphicFramePr>
+                  <a:graphic xmlns:a="http://schemas.openxmlformats.org/drawingml/2006/main">
+                    <a:graphicData uri="http://schemas.openxmlformats.org/drawingml/2006/picture">
+                      <pic:pic xmlns:pic="http://schemas.openxmlformats.org/drawingml/2006/picture">
+                        <pic:nvPicPr>
+                          <pic:cNvPr id="1" name=""/>
+                          <pic:cNvPicPr/>
+                        </pic:nvPicPr>
+                        <pic:blipFill>
+                          <a:blip r:embed="rId30">
+                            <a:extLst>
+                              <a:ext uri="{96DAC541-7B7A-43D3-8B79-37D633B846F1}">
+                                <asvg:svgBlip xmlns:asvg="http://schemas.microsoft.com/office/drawing/2016/SVG/main" r:embed="rId31"/>
+                              </a:ext>
+                            </a:extLst>
+                          </a:blip>
+                          <a:stretch>
+                            <a:fillRect/>
+                          </a:stretch>
+                        </pic:blipFill>
+                        <pic:spPr>
+                          <a:xfrm>
+                            <a:off x="0" y="0"/>
+                            <a:ext cx="2988000" cy="1571850"/>
+                          </a:xfrm>
+                          <a:prstGeom prst="rect">
+                            <a:avLst/>
+                          </a:prstGeom>
+                        </pic:spPr>
+                      </pic:pic>
+                    </a:graphicData>
+                  </a:graphic>
+                </wp:inline>
+              </w:drawing>
+            </w:r>
+          </w:p>
+        </w:tc>
+        <w:tc>
+          <w:tcPr>
+            <w:tcW w:w="4957" w:type="dxa"/>
+            <w:tcBorders>
+              <w:left w:val="single" w:sz="18" w:space="0" w:color="auto"/>
+              <w:bottom w:val="single" w:sz="18" w:space="0" w:color="auto"/>
+              <w:right w:val="single" w:sz="18" w:space="0" w:color="auto"/>
+            </w:tcBorders>
+            <w:vAlign w:val="center"/>
+          </w:tcPr>
+          <w:p>
+            <w:pPr>
+              <w:jc w:val="center"/>
+            </w:pPr>
+            <w:r>
+              <w:rPr>
+                <w:noProof/>
+              </w:rPr>
+              <w:drawing>
+                <wp:inline distT="0" distB="0" distL="0" distR="0" wp14:anchorId="5ADA962C" wp14:editId="112CFB92">
+                  <wp:extent cx="2714643" cy="1800000"/>
+                  <wp:effectExtent l="0" t="0" r="0" b="0"/>
+                  <wp:docPr id="42" name="Graphique 42"/>
+                  <wp:cNvGraphicFramePr>
+                    <a:graphicFrameLocks xmlns:a="http://schemas.openxmlformats.org/drawingml/2006/main" noChangeAspect="1"/>
+                  </wp:cNvGraphicFramePr>
+                  <a:graphic xmlns:a="http://schemas.openxmlformats.org/drawingml/2006/main">
+                    <a:graphicData uri="http://schemas.openxmlformats.org/drawingml/2006/picture">
+                      <pic:pic xmlns:pic="http://schemas.openxmlformats.org/drawingml/2006/picture">
+                        <pic:nvPicPr>
+                          <pic:cNvPr id="1" name=""/>
+                          <pic:cNvPicPr/>
+                        </pic:nvPicPr>
+                        <pic:blipFill>
+                          <a:blip r:embed="rId32">
+                            <a:extLst>
+                              <a:ext uri="{96DAC541-7B7A-43D3-8B79-37D633B846F1}">
+                                <asvg:svgBlip xmlns:asvg="http://schemas.microsoft.com/office/drawing/2016/SVG/main" r:embed="rId33"/>
+                              </a:ext>
+                            </a:extLst>
+                          </a:blip>
+                          <a:stretch>
+                            <a:fillRect/>
+                          </a:stretch>
+                        </pic:blipFill>
+                        <pic:spPr>
+                          <a:xfrm>
+                            <a:off x="0" y="0"/>
+                            <a:ext cx="2714643" cy="1800000"/>
+                          </a:xfrm>
+                          <a:prstGeom prst="rect">
+                            <a:avLst/>
+                          </a:prstGeom>
+                        </pic:spPr>
+                      </pic:pic>
+                    </a:graphicData>
+                  </a:graphic>
+                </wp:inline>
+              </w:drawing>
+            </w:r>
+          </w:p>
+        </w:tc>
+      </w:tr>
+      <w:tr>
+        <w:trPr>
+          <w:trHeight w:val="2551"/>
+        </w:trPr>
+        <w:tc>
+          <w:tcPr>
+            <w:tcW w:w="4956" w:type="dxa"/>
+            <w:tcBorders>
+              <w:top w:val="single" w:sz="18" w:space="0" w:color="auto"/>
+              <w:left w:val="single" w:sz="18" w:space="0" w:color="auto"/>
+              <w:bottom w:val="single" w:sz="18" w:space="0" w:color="auto"/>
+            </w:tcBorders>
+            <w:vAlign w:val="center"/>
+          </w:tcPr>
+          <w:p>
+            <w:pPr>
+              <w:pStyle w:val="Paragraphedeliste"/>
+              <w:numPr>
+                <w:ilvl w:val="0"/>
+                <w:numId w:val="25"/>
+              </w:numPr>
+              <w:spacing w:before="100" w:beforeAutospacing="1"/>
+              <w:ind w:left="449"/>
+              <w:rPr>
+                <w:sz w:val="24"/>
+                <w:szCs w:val="24"/>
+              </w:rPr>
+            </w:pPr>
+            <w:r>
+              <w:t>On trace la demi droite.</w:t>
+            </w:r>
+          </w:p>
+        </w:tc>
+        <w:tc>
+          <w:tcPr>
+            <w:tcW w:w="4957" w:type="dxa"/>
+            <w:tcBorders>
+              <w:top w:val="single" w:sz="18" w:space="0" w:color="auto"/>
+              <w:bottom w:val="single" w:sz="18" w:space="0" w:color="auto"/>
+              <w:right w:val="single" w:sz="18" w:space="0" w:color="auto"/>
+            </w:tcBorders>
+            <w:vAlign w:val="center"/>
+          </w:tcPr>
+          <w:p>
+            <w:pPr>
+              <w:jc w:val="center"/>
+              <w:rPr>
+                <w:noProof/>
+              </w:rPr>
+            </w:pPr>
+            <w:r>
+              <w:rPr>
+                <w:noProof/>
+              </w:rPr>
+              <w:drawing>
+                <wp:inline distT="0" distB="0" distL="0" distR="0" wp14:anchorId="74632331" wp14:editId="4CA9CE30">
+                  <wp:extent cx="1790250" cy="1584000"/>
+                  <wp:effectExtent l="0" t="0" r="635" b="0"/>
+                  <wp:docPr id="43" name="Graphique 43"/>
+                  <wp:cNvGraphicFramePr>
+                    <a:graphicFrameLocks xmlns:a="http://schemas.openxmlformats.org/drawingml/2006/main" noChangeAspect="1"/>
+                  </wp:cNvGraphicFramePr>
+                  <a:graphic xmlns:a="http://schemas.openxmlformats.org/drawingml/2006/main">
+                    <a:graphicData uri="http://schemas.openxmlformats.org/drawingml/2006/picture">
+                      <pic:pic xmlns:pic="http://schemas.openxmlformats.org/drawingml/2006/picture">
+                        <pic:nvPicPr>
+                          <pic:cNvPr id="1" name=""/>
+                          <pic:cNvPicPr/>
+                        </pic:nvPicPr>
+                        <pic:blipFill>
+                          <a:blip r:embed="rId34">
+                            <a:extLst>
+                              <a:ext uri="{96DAC541-7B7A-43D3-8B79-37D633B846F1}">
+                                <asvg:svgBlip xmlns:asvg="http://schemas.microsoft.com/office/drawing/2016/SVG/main" r:embed="rId35"/>
+                              </a:ext>
+                            </a:extLst>
+                          </a:blip>
+                          <a:stretch>
+                            <a:fillRect/>
+                          </a:stretch>
+                        </pic:blipFill>
+                        <pic:spPr>
+                          <a:xfrm>
+                            <a:off x="0" y="0"/>
+                            <a:ext cx="1790250" cy="1584000"/>
+                          </a:xfrm>
+                          <a:prstGeom prst="rect">
+                            <a:avLst/>
+                          </a:prstGeom>
+                        </pic:spPr>
+                      </pic:pic>
+                    </a:graphicData>
+                  </a:graphic>
+                </wp:inline>
+              </w:drawing>
+            </w:r>
+          </w:p>
+        </w:tc>
+      </w:tr>
+    </w:tbl>
+    <w:p>
+      <w:pPr>
+        <w:pStyle w:val="Titre1"/>
+      </w:pPr>
+      <w:r>
+        <w:t>I</w:t>
+      </w:r>
       <w:r>
         <w:t>I</w:t>
       </w:r>
@@ -2072,10 +2580,10 @@
                           <pic:cNvPicPr/>
                         </pic:nvPicPr>
                         <pic:blipFill>
-                          <a:blip r:embed="rId26">
+                          <a:blip r:embed="rId36">
                             <a:extLst>
                               <a:ext uri="{96DAC541-7B7A-43D3-8B79-37D633B846F1}">
-                                <asvg:svgBlip xmlns:asvg="http://schemas.microsoft.com/office/drawing/2016/SVG/main" r:embed="rId27"/>
+                                <asvg:svgBlip xmlns:asvg="http://schemas.microsoft.com/office/drawing/2016/SVG/main" r:embed="rId37"/>
                               </a:ext>
                             </a:extLst>
                           </a:blip>
@@ -2383,13 +2891,13 @@
                           <pic:cNvPicPr/>
                         </pic:nvPicPr>
                         <pic:blipFill>
-                          <a:blip r:embed="rId28">
+                          <a:blip r:embed="rId38">
                             <a:extLst>
                               <a:ext uri="{28A0092B-C50C-407E-A947-70E740481C1C}">
                                 <a14:useLocalDpi xmlns:a14="http://schemas.microsoft.com/office/drawing/2010/main" val="0"/>
                               </a:ext>
                               <a:ext uri="{96DAC541-7B7A-43D3-8B79-37D633B846F1}">
-                                <asvg:svgBlip xmlns:asvg="http://schemas.microsoft.com/office/drawing/2016/SVG/main" r:embed="rId29"/>
+                                <asvg:svgBlip xmlns:asvg="http://schemas.microsoft.com/office/drawing/2016/SVG/main" r:embed="rId39"/>
                               </a:ext>
                             </a:extLst>
                           </a:blip>
@@ -2514,30 +3022,6 @@
     </w:tbl>
     <w:p>
       <w:pPr>
-        <w:spacing w:before="240" w:line="240" w:lineRule="auto"/>
-        <w:rPr>
-          <w:rStyle w:val="Accentuationlgre"/>
-          <w:sz w:val="28"/>
-          <w:szCs w:val="28"/>
-          <w:lang w:eastAsia="fr-FR"/>
-        </w:rPr>
-      </w:pPr>
-      <w:r>
-        <w:rPr>
-          <w:rStyle w:val="Accentuationlgre"/>
-          <w:sz w:val="28"/>
-          <w:szCs w:val="28"/>
-          <w:lang w:eastAsia="fr-FR"/>
-        </w:rPr>
-        <w:t>Remarque :</w:t>
-      </w:r>
-    </w:p>
-    <w:p>
-      <w:pPr>
-        <w:numPr>
-          <w:ilvl w:val="0"/>
-          <w:numId w:val="22"/>
-        </w:numPr>
         <w:spacing w:before="100" w:beforeAutospacing="1" w:after="100" w:afterAutospacing="1" w:line="240" w:lineRule="auto"/>
         <w:rPr>
           <w:rFonts w:eastAsia="Times New Roman" w:cs="Times New Roman"/>
@@ -2546,10 +3030,208 @@
       </w:pPr>
       <w:r>
         <w:rPr>
-          <w:rFonts w:eastAsia="Times New Roman" w:cs="Times New Roman"/>
+          <w:noProof/>
           <w:lang w:eastAsia="fr-FR"/>
         </w:rPr>
-        <w:t>Des angles dont la somme des mesures est égale à 180° sont dits supplémentaires.</w:t>
+        <mc:AlternateContent>
+          <mc:Choice Requires="wps">
+            <w:drawing>
+              <wp:inline distT="0" distB="0" distL="0" distR="0" wp14:anchorId="5B3D9F60" wp14:editId="661811FF">
+                <wp:extent cx="6200349" cy="789011"/>
+                <wp:effectExtent l="57150" t="57150" r="10160" b="11430"/>
+                <wp:docPr id="2" name="Zone de texte 2"/>
+                <wp:cNvGraphicFramePr>
+                  <a:graphicFrameLocks xmlns:a="http://schemas.openxmlformats.org/drawingml/2006/main"/>
+                </wp:cNvGraphicFramePr>
+                <a:graphic xmlns:a="http://schemas.openxmlformats.org/drawingml/2006/main">
+                  <a:graphicData uri="http://schemas.microsoft.com/office/word/2010/wordprocessingShape">
+                    <wps:wsp>
+                      <wps:cNvSpPr txBox="1">
+                        <a:spLocks noChangeArrowheads="1"/>
+                      </wps:cNvSpPr>
+                      <wps:spPr bwMode="auto">
+                        <a:xfrm>
+                          <a:off x="0" y="0"/>
+                          <a:ext cx="6200349" cy="789011"/>
+                        </a:xfrm>
+                        <a:prstGeom prst="rect">
+                          <a:avLst/>
+                        </a:prstGeom>
+                        <a:solidFill>
+                          <a:srgbClr val="FFFFFF"/>
+                        </a:solidFill>
+                        <a:ln w="12700" cmpd="dbl">
+                          <a:solidFill>
+                            <a:srgbClr val="000000"/>
+                          </a:solidFill>
+                          <a:miter lim="800000"/>
+                          <a:headEnd/>
+                          <a:tailEnd/>
+                        </a:ln>
+                        <a:effectLst>
+                          <a:outerShdw dist="63500" dir="13500000" algn="br" rotWithShape="0">
+                            <a:schemeClr val="bg1">
+                              <a:lumMod val="85000"/>
+                              <a:lumOff val="0"/>
+                            </a:schemeClr>
+                          </a:outerShdw>
+                        </a:effectLst>
+                      </wps:spPr>
+                      <wps:txbx>
+                        <w:txbxContent>
+                          <w:p>
+                            <w:pPr>
+                              <w:tabs>
+                                <w:tab w:val="left" w:pos="9456"/>
+                              </w:tabs>
+                              <w:spacing w:before="240" w:line="480" w:lineRule="auto"/>
+                              <w:rPr>
+                                <w:rFonts w:ascii="Cambria Math" w:hAnsi="Cambria Math"/>
+                                <w:sz w:val="24"/>
+                                <w:szCs w:val="24"/>
+                                <w:u w:val="dash"/>
+                              </w:rPr>
+                            </w:pPr>
+                            <w:r>
+                              <w:rPr>
+                                <w:rFonts w:ascii="Cambria Math" w:hAnsi="Cambria Math"/>
+                                <w:sz w:val="24"/>
+                                <w:szCs w:val="24"/>
+                                <w:u w:val="dash"/>
+                              </w:rPr>
+                              <w:tab/>
+                            </w:r>
+                            <w:r>
+                              <w:rPr>
+                                <w:rFonts w:ascii="Cambria Math" w:hAnsi="Cambria Math"/>
+                                <w:sz w:val="24"/>
+                                <w:szCs w:val="24"/>
+                                <w:u w:val="dash"/>
+                              </w:rPr>
+                              <w:tab/>
+                            </w:r>
+                            <w:r>
+                              <w:rPr>
+                                <w:rFonts w:ascii="Cambria Math" w:hAnsi="Cambria Math"/>
+                                <w:sz w:val="24"/>
+                                <w:szCs w:val="24"/>
+                                <w:u w:val="dash"/>
+                              </w:rPr>
+                              <w:tab/>
+                            </w:r>
+                            <w:r>
+                              <w:rPr>
+                                <w:rFonts w:ascii="Cambria Math" w:hAnsi="Cambria Math"/>
+                                <w:sz w:val="24"/>
+                                <w:szCs w:val="24"/>
+                                <w:u w:val="dash"/>
+                              </w:rPr>
+                              <w:tab/>
+                            </w:r>
+                          </w:p>
+                          <w:p>
+                            <w:pPr>
+                              <w:tabs>
+                                <w:tab w:val="left" w:pos="8760"/>
+                              </w:tabs>
+                              <w:rPr>
+                                <w:rFonts w:ascii="Cambria Math" w:hAnsi="Cambria Math"/>
+                                <w:sz w:val="24"/>
+                                <w:szCs w:val="24"/>
+                              </w:rPr>
+                            </w:pPr>
+                          </w:p>
+                        </w:txbxContent>
+                      </wps:txbx>
+                      <wps:bodyPr rot="0" vert="horz" wrap="square" lIns="91440" tIns="45720" rIns="91440" bIns="45720" anchor="t" anchorCtr="0" upright="1">
+                        <a:noAutofit/>
+                      </wps:bodyPr>
+                    </wps:wsp>
+                  </a:graphicData>
+                </a:graphic>
+              </wp:inline>
+            </w:drawing>
+          </mc:Choice>
+          <mc:Fallback>
+            <w:pict>
+              <v:shapetype w14:anchorId="5B3D9F60" id="_x0000_t202" coordsize="21600,21600" o:spt="202" path="m,l,21600r21600,l21600,xe">
+                <v:stroke joinstyle="miter"/>
+                <v:path gradientshapeok="t" o:connecttype="rect"/>
+              </v:shapetype>
+              <v:shape id="_x0000_s1029" type="#_x0000_t202" style="width:488.2pt;height:62.15pt;visibility:visible;mso-wrap-style:square;mso-left-percent:-10001;mso-top-percent:-10001;mso-position-horizontal:absolute;mso-position-horizontal-relative:char;mso-position-vertical:absolute;mso-position-vertical-relative:line;mso-left-percent:-10001;mso-top-percent:-10001;v-text-anchor:top" o:gfxdata="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" strokeweight="1pt">
+                <v:stroke linestyle="thinThin"/>
+                <v:shadow on="t" color="#d8d8d8 [2732]" origin=".5,.5" offset="-1.24725mm,-1.24725mm"/>
+                <v:textbox>
+                  <w:txbxContent>
+                    <w:p>
+                      <w:pPr>
+                        <w:tabs>
+                          <w:tab w:val="left" w:pos="9456"/>
+                        </w:tabs>
+                        <w:spacing w:before="240" w:line="480" w:lineRule="auto"/>
+                        <w:rPr>
+                          <w:rFonts w:ascii="Cambria Math" w:hAnsi="Cambria Math"/>
+                          <w:sz w:val="24"/>
+                          <w:szCs w:val="24"/>
+                          <w:u w:val="dash"/>
+                        </w:rPr>
+                      </w:pPr>
+                      <w:r>
+                        <w:rPr>
+                          <w:rFonts w:ascii="Cambria Math" w:hAnsi="Cambria Math"/>
+                          <w:sz w:val="24"/>
+                          <w:szCs w:val="24"/>
+                          <w:u w:val="dash"/>
+                        </w:rPr>
+                        <w:tab/>
+                      </w:r>
+                      <w:r>
+                        <w:rPr>
+                          <w:rFonts w:ascii="Cambria Math" w:hAnsi="Cambria Math"/>
+                          <w:sz w:val="24"/>
+                          <w:szCs w:val="24"/>
+                          <w:u w:val="dash"/>
+                        </w:rPr>
+                        <w:tab/>
+                      </w:r>
+                      <w:r>
+                        <w:rPr>
+                          <w:rFonts w:ascii="Cambria Math" w:hAnsi="Cambria Math"/>
+                          <w:sz w:val="24"/>
+                          <w:szCs w:val="24"/>
+                          <w:u w:val="dash"/>
+                        </w:rPr>
+                        <w:tab/>
+                      </w:r>
+                      <w:r>
+                        <w:rPr>
+                          <w:rFonts w:ascii="Cambria Math" w:hAnsi="Cambria Math"/>
+                          <w:sz w:val="24"/>
+                          <w:szCs w:val="24"/>
+                          <w:u w:val="dash"/>
+                        </w:rPr>
+                        <w:tab/>
+                      </w:r>
+                    </w:p>
+                    <w:p>
+                      <w:pPr>
+                        <w:tabs>
+                          <w:tab w:val="left" w:pos="8760"/>
+                        </w:tabs>
+                        <w:rPr>
+                          <w:rFonts w:ascii="Cambria Math" w:hAnsi="Cambria Math"/>
+                          <w:sz w:val="24"/>
+                          <w:szCs w:val="24"/>
+                        </w:rPr>
+                      </w:pPr>
+                    </w:p>
+                  </w:txbxContent>
+                </v:textbox>
+                <w10:anchorlock/>
+              </v:shape>
+            </w:pict>
+          </mc:Fallback>
+        </mc:AlternateContent>
       </w:r>
     </w:p>
     <w:tbl>
@@ -2603,13 +3285,13 @@
                           <pic:cNvPicPr/>
                         </pic:nvPicPr>
                         <pic:blipFill>
-                          <a:blip r:embed="rId30">
+                          <a:blip r:embed="rId40">
                             <a:extLst>
                               <a:ext uri="{28A0092B-C50C-407E-A947-70E740481C1C}">
                                 <a14:useLocalDpi xmlns:a14="http://schemas.microsoft.com/office/drawing/2010/main" val="0"/>
                               </a:ext>
                               <a:ext uri="{96DAC541-7B7A-43D3-8B79-37D633B846F1}">
-                                <asvg:svgBlip xmlns:asvg="http://schemas.microsoft.com/office/drawing/2016/SVG/main" r:embed="rId31"/>
+                                <asvg:svgBlip xmlns:asvg="http://schemas.microsoft.com/office/drawing/2016/SVG/main" r:embed="rId41"/>
                               </a:ext>
                             </a:extLst>
                           </a:blip>
@@ -2736,7 +3418,7 @@
                 <w:b/>
                 <w:bCs/>
               </w:rPr>
-              <w:t>complémentaires</w:t>
+              <w:t>supplémentaires</w:t>
             </w:r>
             <w:r>
               <w:t xml:space="preserve"> car :</w:t>
@@ -2882,10 +3564,10 @@
                           <pic:cNvPicPr/>
                         </pic:nvPicPr>
                         <pic:blipFill>
-                          <a:blip r:embed="rId32">
+                          <a:blip r:embed="rId42">
                             <a:extLst>
                               <a:ext uri="{96DAC541-7B7A-43D3-8B79-37D633B846F1}">
-                                <asvg:svgBlip xmlns:asvg="http://schemas.microsoft.com/office/drawing/2016/SVG/main" r:embed="rId33"/>
+                                <asvg:svgBlip xmlns:asvg="http://schemas.microsoft.com/office/drawing/2016/SVG/main" r:embed="rId43"/>
                               </a:ext>
                             </a:extLst>
                           </a:blip>
@@ -3330,13 +4012,13 @@
                           <pic:cNvPicPr/>
                         </pic:nvPicPr>
                         <pic:blipFill>
-                          <a:blip r:embed="rId34">
+                          <a:blip r:embed="rId44">
                             <a:extLst>
                               <a:ext uri="{28A0092B-C50C-407E-A947-70E740481C1C}">
                                 <a14:useLocalDpi xmlns:a14="http://schemas.microsoft.com/office/drawing/2010/main" val="0"/>
                               </a:ext>
                               <a:ext uri="{96DAC541-7B7A-43D3-8B79-37D633B846F1}">
-                                <asvg:svgBlip xmlns:asvg="http://schemas.microsoft.com/office/drawing/2016/SVG/main" r:embed="rId35"/>
+                                <asvg:svgBlip xmlns:asvg="http://schemas.microsoft.com/office/drawing/2016/SVG/main" r:embed="rId45"/>
                               </a:ext>
                             </a:extLst>
                           </a:blip>
@@ -3395,13 +4077,13 @@
                           <pic:cNvPicPr/>
                         </pic:nvPicPr>
                         <pic:blipFill>
-                          <a:blip r:embed="rId36">
+                          <a:blip r:embed="rId46">
                             <a:extLst>
                               <a:ext uri="{28A0092B-C50C-407E-A947-70E740481C1C}">
                                 <a14:useLocalDpi xmlns:a14="http://schemas.microsoft.com/office/drawing/2010/main" val="0"/>
                               </a:ext>
                               <a:ext uri="{96DAC541-7B7A-43D3-8B79-37D633B846F1}">
-                                <asvg:svgBlip xmlns:asvg="http://schemas.microsoft.com/office/drawing/2016/SVG/main" r:embed="rId37"/>
+                                <asvg:svgBlip xmlns:asvg="http://schemas.microsoft.com/office/drawing/2016/SVG/main" r:embed="rId47"/>
                               </a:ext>
                             </a:extLst>
                           </a:blip>
@@ -3462,13 +4144,13 @@
                           <pic:cNvPicPr/>
                         </pic:nvPicPr>
                         <pic:blipFill>
-                          <a:blip r:embed="rId38">
+                          <a:blip r:embed="rId48">
                             <a:extLst>
                               <a:ext uri="{28A0092B-C50C-407E-A947-70E740481C1C}">
                                 <a14:useLocalDpi xmlns:a14="http://schemas.microsoft.com/office/drawing/2010/main" val="0"/>
                               </a:ext>
                               <a:ext uri="{96DAC541-7B7A-43D3-8B79-37D633B846F1}">
-                                <asvg:svgBlip xmlns:asvg="http://schemas.microsoft.com/office/drawing/2016/SVG/main" r:embed="rId39"/>
+                                <asvg:svgBlip xmlns:asvg="http://schemas.microsoft.com/office/drawing/2016/SVG/main" r:embed="rId49"/>
                               </a:ext>
                             </a:extLst>
                           </a:blip>
@@ -3501,446 +4183,6 @@
       </w:pPr>
       <w:r>
         <w:lastRenderedPageBreak/>
-        <w:t>Angles alternes-</w:t>
-      </w:r>
-      <w:r>
-        <w:t>externes</w:t>
-      </w:r>
-      <w:r>
-        <w:t xml:space="preserve"> </w:t>
-      </w:r>
-    </w:p>
-    <w:tbl>
-      <w:tblPr>
-        <w:tblStyle w:val="Grilledutableau"/>
-        <w:tblW w:w="9921" w:type="dxa"/>
-        <w:tblBorders>
-          <w:top w:val="none" w:sz="0" w:space="0" w:color="auto"/>
-          <w:left w:val="none" w:sz="0" w:space="0" w:color="auto"/>
-          <w:bottom w:val="none" w:sz="0" w:space="0" w:color="auto"/>
-          <w:right w:val="none" w:sz="0" w:space="0" w:color="auto"/>
-          <w:insideH w:val="none" w:sz="0" w:space="0" w:color="auto"/>
-          <w:insideV w:val="none" w:sz="0" w:space="0" w:color="auto"/>
-        </w:tblBorders>
-        <w:tblLook w:val="04A0" w:firstRow="1" w:lastRow="0" w:firstColumn="1" w:lastColumn="0" w:noHBand="0" w:noVBand="1"/>
-      </w:tblPr>
-      <w:tblGrid>
-        <w:gridCol w:w="3119"/>
-        <w:gridCol w:w="3119"/>
-        <w:gridCol w:w="3683"/>
-      </w:tblGrid>
-      <w:tr>
-        <w:tc>
-          <w:tcPr>
-            <w:tcW w:w="3119" w:type="dxa"/>
-            <w:tcBorders>
-              <w:top w:val="single" w:sz="18" w:space="0" w:color="auto"/>
-              <w:left w:val="single" w:sz="18" w:space="0" w:color="auto"/>
-              <w:right w:val="single" w:sz="18" w:space="0" w:color="auto"/>
-            </w:tcBorders>
-            <w:vAlign w:val="center"/>
-          </w:tcPr>
-          <w:p>
-            <w:pPr>
-              <w:tabs>
-                <w:tab w:val="left" w:pos="2902"/>
-              </w:tabs>
-              <w:spacing w:before="240" w:line="480" w:lineRule="auto"/>
-              <w:jc w:val="center"/>
-            </w:pPr>
-            <w:r>
-              <w:rPr>
-                <w:u w:val="dash"/>
-              </w:rPr>
-              <w:tab/>
-            </w:r>
-            <w:r>
-              <w:rPr>
-                <w:u w:val="dash"/>
-              </w:rPr>
-              <w:tab/>
-            </w:r>
-            <w:r>
-              <w:rPr>
-                <w:u w:val="dash"/>
-              </w:rPr>
-              <w:tab/>
-            </w:r>
-            <w:r>
-              <w:rPr>
-                <w:u w:val="dash"/>
-              </w:rPr>
-              <w:tab/>
-            </w:r>
-            <w:r>
-              <w:rPr>
-                <w:u w:val="dash"/>
-              </w:rPr>
-              <w:tab/>
-            </w:r>
-            <w:r>
-              <w:rPr>
-                <w:u w:val="dash"/>
-              </w:rPr>
-              <w:tab/>
-            </w:r>
-            <w:r>
-              <w:rPr>
-                <w:u w:val="dash"/>
-              </w:rPr>
-              <w:tab/>
-            </w:r>
-            <w:r>
-              <w:rPr>
-                <w:u w:val="dash"/>
-              </w:rPr>
-              <w:tab/>
-            </w:r>
-          </w:p>
-        </w:tc>
-        <w:tc>
-          <w:tcPr>
-            <w:tcW w:w="3119" w:type="dxa"/>
-            <w:tcBorders>
-              <w:top w:val="single" w:sz="18" w:space="0" w:color="auto"/>
-              <w:left w:val="single" w:sz="18" w:space="0" w:color="auto"/>
-              <w:right w:val="single" w:sz="18" w:space="0" w:color="auto"/>
-            </w:tcBorders>
-            <w:vAlign w:val="center"/>
-          </w:tcPr>
-          <w:p>
-            <w:pPr>
-              <w:tabs>
-                <w:tab w:val="left" w:pos="2903"/>
-              </w:tabs>
-              <w:spacing w:before="240" w:line="480" w:lineRule="auto"/>
-              <w:jc w:val="center"/>
-            </w:pPr>
-            <w:r>
-              <w:rPr>
-                <w:u w:val="dash"/>
-              </w:rPr>
-              <w:tab/>
-            </w:r>
-            <w:r>
-              <w:rPr>
-                <w:u w:val="dash"/>
-              </w:rPr>
-              <w:tab/>
-            </w:r>
-            <w:r>
-              <w:rPr>
-                <w:u w:val="dash"/>
-              </w:rPr>
-              <w:tab/>
-            </w:r>
-            <w:r>
-              <w:rPr>
-                <w:u w:val="dash"/>
-              </w:rPr>
-              <w:tab/>
-            </w:r>
-            <w:r>
-              <w:rPr>
-                <w:u w:val="dash"/>
-              </w:rPr>
-              <w:tab/>
-            </w:r>
-            <w:r>
-              <w:rPr>
-                <w:u w:val="dash"/>
-              </w:rPr>
-              <w:tab/>
-            </w:r>
-            <w:r>
-              <w:rPr>
-                <w:u w:val="dash"/>
-              </w:rPr>
-              <w:tab/>
-            </w:r>
-            <w:r>
-              <w:rPr>
-                <w:u w:val="dash"/>
-              </w:rPr>
-              <w:tab/>
-            </w:r>
-          </w:p>
-        </w:tc>
-        <w:tc>
-          <w:tcPr>
-            <w:tcW w:w="3683" w:type="dxa"/>
-            <w:tcBorders>
-              <w:top w:val="single" w:sz="18" w:space="0" w:color="auto"/>
-              <w:left w:val="single" w:sz="18" w:space="0" w:color="auto"/>
-              <w:right w:val="single" w:sz="18" w:space="0" w:color="auto"/>
-            </w:tcBorders>
-            <w:vAlign w:val="center"/>
-          </w:tcPr>
-          <w:p>
-            <w:pPr>
-              <w:tabs>
-                <w:tab w:val="left" w:pos="3461"/>
-              </w:tabs>
-              <w:spacing w:before="240" w:line="480" w:lineRule="auto"/>
-              <w:jc w:val="center"/>
-            </w:pPr>
-            <w:r>
-              <w:rPr>
-                <w:u w:val="dash"/>
-              </w:rPr>
-              <w:tab/>
-            </w:r>
-            <w:r>
-              <w:rPr>
-                <w:u w:val="dash"/>
-              </w:rPr>
-              <w:tab/>
-            </w:r>
-            <w:r>
-              <w:rPr>
-                <w:u w:val="dash"/>
-              </w:rPr>
-              <w:tab/>
-            </w:r>
-            <w:r>
-              <w:rPr>
-                <w:u w:val="dash"/>
-              </w:rPr>
-              <w:tab/>
-            </w:r>
-            <w:r>
-              <w:rPr>
-                <w:u w:val="dash"/>
-              </w:rPr>
-              <w:tab/>
-            </w:r>
-            <w:r>
-              <w:rPr>
-                <w:u w:val="dash"/>
-              </w:rPr>
-              <w:tab/>
-            </w:r>
-            <w:r>
-              <w:rPr>
-                <w:u w:val="dash"/>
-              </w:rPr>
-              <w:tab/>
-            </w:r>
-            <w:r>
-              <w:rPr>
-                <w:u w:val="dash"/>
-              </w:rPr>
-              <w:tab/>
-            </w:r>
-          </w:p>
-        </w:tc>
-      </w:tr>
-      <w:tr>
-        <w:tc>
-          <w:tcPr>
-            <w:tcW w:w="3119" w:type="dxa"/>
-            <w:tcBorders>
-              <w:left w:val="single" w:sz="18" w:space="0" w:color="auto"/>
-              <w:bottom w:val="single" w:sz="18" w:space="0" w:color="auto"/>
-              <w:right w:val="single" w:sz="18" w:space="0" w:color="auto"/>
-            </w:tcBorders>
-            <w:vAlign w:val="center"/>
-          </w:tcPr>
-          <w:p>
-            <w:pPr>
-              <w:jc w:val="center"/>
-            </w:pPr>
-            <w:r>
-              <w:rPr>
-                <w:noProof/>
-              </w:rPr>
-              <w:drawing>
-                <wp:inline distT="0" distB="0" distL="0" distR="0" wp14:anchorId="2798856B" wp14:editId="214332BD">
-                  <wp:extent cx="1440000" cy="1158675"/>
-                  <wp:effectExtent l="0" t="0" r="8255" b="3810"/>
-                  <wp:docPr id="19" name="Graphique 19"/>
-                  <wp:cNvGraphicFramePr>
-                    <a:graphicFrameLocks xmlns:a="http://schemas.openxmlformats.org/drawingml/2006/main" noChangeAspect="1"/>
-                  </wp:cNvGraphicFramePr>
-                  <a:graphic xmlns:a="http://schemas.openxmlformats.org/drawingml/2006/main">
-                    <a:graphicData uri="http://schemas.openxmlformats.org/drawingml/2006/picture">
-                      <pic:pic xmlns:pic="http://schemas.openxmlformats.org/drawingml/2006/picture">
-                        <pic:nvPicPr>
-                          <pic:cNvPr id="19" name="Graphique 19"/>
-                          <pic:cNvPicPr/>
-                        </pic:nvPicPr>
-                        <pic:blipFill>
-                          <a:blip r:embed="rId40">
-                            <a:extLst>
-                              <a:ext uri="{28A0092B-C50C-407E-A947-70E740481C1C}">
-                                <a14:useLocalDpi xmlns:a14="http://schemas.microsoft.com/office/drawing/2010/main" val="0"/>
-                              </a:ext>
-                              <a:ext uri="{96DAC541-7B7A-43D3-8B79-37D633B846F1}">
-                                <asvg:svgBlip xmlns:asvg="http://schemas.microsoft.com/office/drawing/2016/SVG/main" r:embed="rId41"/>
-                              </a:ext>
-                            </a:extLst>
-                          </a:blip>
-                          <a:stretch>
-                            <a:fillRect/>
-                          </a:stretch>
-                        </pic:blipFill>
-                        <pic:spPr>
-                          <a:xfrm>
-                            <a:off x="0" y="0"/>
-                            <a:ext cx="1440000" cy="1158675"/>
-                          </a:xfrm>
-                          <a:prstGeom prst="rect">
-                            <a:avLst/>
-                          </a:prstGeom>
-                        </pic:spPr>
-                      </pic:pic>
-                    </a:graphicData>
-                  </a:graphic>
-                </wp:inline>
-              </w:drawing>
-            </w:r>
-          </w:p>
-        </w:tc>
-        <w:tc>
-          <w:tcPr>
-            <w:tcW w:w="3119" w:type="dxa"/>
-            <w:tcBorders>
-              <w:left w:val="single" w:sz="18" w:space="0" w:color="auto"/>
-              <w:bottom w:val="single" w:sz="18" w:space="0" w:color="auto"/>
-              <w:right w:val="single" w:sz="18" w:space="0" w:color="auto"/>
-            </w:tcBorders>
-            <w:vAlign w:val="center"/>
-          </w:tcPr>
-          <w:p>
-            <w:pPr>
-              <w:jc w:val="center"/>
-            </w:pPr>
-            <w:r>
-              <w:rPr>
-                <w:noProof/>
-              </w:rPr>
-              <w:drawing>
-                <wp:inline distT="0" distB="0" distL="0" distR="0" wp14:anchorId="79055B84" wp14:editId="5D94D07C">
-                  <wp:extent cx="1440000" cy="1158675"/>
-                  <wp:effectExtent l="0" t="0" r="8255" b="3810"/>
-                  <wp:docPr id="20" name="Graphique 20"/>
-                  <wp:cNvGraphicFramePr>
-                    <a:graphicFrameLocks xmlns:a="http://schemas.openxmlformats.org/drawingml/2006/main" noChangeAspect="1"/>
-                  </wp:cNvGraphicFramePr>
-                  <a:graphic xmlns:a="http://schemas.openxmlformats.org/drawingml/2006/main">
-                    <a:graphicData uri="http://schemas.openxmlformats.org/drawingml/2006/picture">
-                      <pic:pic xmlns:pic="http://schemas.openxmlformats.org/drawingml/2006/picture">
-                        <pic:nvPicPr>
-                          <pic:cNvPr id="20" name="Graphique 20"/>
-                          <pic:cNvPicPr/>
-                        </pic:nvPicPr>
-                        <pic:blipFill>
-                          <a:blip r:embed="rId42">
-                            <a:extLst>
-                              <a:ext uri="{28A0092B-C50C-407E-A947-70E740481C1C}">
-                                <a14:useLocalDpi xmlns:a14="http://schemas.microsoft.com/office/drawing/2010/main" val="0"/>
-                              </a:ext>
-                              <a:ext uri="{96DAC541-7B7A-43D3-8B79-37D633B846F1}">
-                                <asvg:svgBlip xmlns:asvg="http://schemas.microsoft.com/office/drawing/2016/SVG/main" r:embed="rId43"/>
-                              </a:ext>
-                            </a:extLst>
-                          </a:blip>
-                          <a:stretch>
-                            <a:fillRect/>
-                          </a:stretch>
-                        </pic:blipFill>
-                        <pic:spPr>
-                          <a:xfrm>
-                            <a:off x="0" y="0"/>
-                            <a:ext cx="1440000" cy="1158675"/>
-                          </a:xfrm>
-                          <a:prstGeom prst="rect">
-                            <a:avLst/>
-                          </a:prstGeom>
-                        </pic:spPr>
-                      </pic:pic>
-                    </a:graphicData>
-                  </a:graphic>
-                </wp:inline>
-              </w:drawing>
-            </w:r>
-          </w:p>
-        </w:tc>
-        <w:tc>
-          <w:tcPr>
-            <w:tcW w:w="3683" w:type="dxa"/>
-            <w:tcBorders>
-              <w:left w:val="single" w:sz="18" w:space="0" w:color="auto"/>
-              <w:bottom w:val="single" w:sz="18" w:space="0" w:color="auto"/>
-              <w:right w:val="single" w:sz="18" w:space="0" w:color="auto"/>
-            </w:tcBorders>
-          </w:tcPr>
-          <w:p>
-            <w:pPr>
-              <w:jc w:val="center"/>
-              <w:rPr>
-                <w:noProof/>
-              </w:rPr>
-            </w:pPr>
-            <w:r>
-              <w:rPr>
-                <w:noProof/>
-              </w:rPr>
-              <w:drawing>
-                <wp:inline distT="0" distB="0" distL="0" distR="0" wp14:anchorId="5F29A11D" wp14:editId="5B16CEEB">
-                  <wp:extent cx="1440000" cy="1186169"/>
-                  <wp:effectExtent l="0" t="0" r="8255" b="0"/>
-                  <wp:docPr id="32" name="Graphique 32"/>
-                  <wp:cNvGraphicFramePr>
-                    <a:graphicFrameLocks xmlns:a="http://schemas.openxmlformats.org/drawingml/2006/main" noChangeAspect="1"/>
-                  </wp:cNvGraphicFramePr>
-                  <a:graphic xmlns:a="http://schemas.openxmlformats.org/drawingml/2006/main">
-                    <a:graphicData uri="http://schemas.openxmlformats.org/drawingml/2006/picture">
-                      <pic:pic xmlns:pic="http://schemas.openxmlformats.org/drawingml/2006/picture">
-                        <pic:nvPicPr>
-                          <pic:cNvPr id="32" name="Graphique 32"/>
-                          <pic:cNvPicPr/>
-                        </pic:nvPicPr>
-                        <pic:blipFill>
-                          <a:blip r:embed="rId44">
-                            <a:extLst>
-                              <a:ext uri="{28A0092B-C50C-407E-A947-70E740481C1C}">
-                                <a14:useLocalDpi xmlns:a14="http://schemas.microsoft.com/office/drawing/2010/main" val="0"/>
-                              </a:ext>
-                              <a:ext uri="{96DAC541-7B7A-43D3-8B79-37D633B846F1}">
-                                <asvg:svgBlip xmlns:asvg="http://schemas.microsoft.com/office/drawing/2016/SVG/main" r:embed="rId45"/>
-                              </a:ext>
-                            </a:extLst>
-                          </a:blip>
-                          <a:stretch>
-                            <a:fillRect/>
-                          </a:stretch>
-                        </pic:blipFill>
-                        <pic:spPr>
-                          <a:xfrm>
-                            <a:off x="0" y="0"/>
-                            <a:ext cx="1440000" cy="1186169"/>
-                          </a:xfrm>
-                          <a:prstGeom prst="rect">
-                            <a:avLst/>
-                          </a:prstGeom>
-                        </pic:spPr>
-                      </pic:pic>
-                    </a:graphicData>
-                  </a:graphic>
-                </wp:inline>
-              </w:drawing>
-            </w:r>
-          </w:p>
-        </w:tc>
-      </w:tr>
-    </w:tbl>
-    <w:p/>
-    <w:p>
-      <w:pPr>
-        <w:pStyle w:val="Titre2"/>
-      </w:pPr>
-      <w:r>
         <w:t xml:space="preserve">Angles </w:t>
       </w:r>
       <w:r>
@@ -4228,13 +4470,13 @@
                           <pic:cNvPicPr/>
                         </pic:nvPicPr>
                         <pic:blipFill>
-                          <a:blip r:embed="rId46">
+                          <a:blip r:embed="rId50">
                             <a:extLst>
                               <a:ext uri="{28A0092B-C50C-407E-A947-70E740481C1C}">
                                 <a14:useLocalDpi xmlns:a14="http://schemas.microsoft.com/office/drawing/2010/main" val="0"/>
                               </a:ext>
                               <a:ext uri="{96DAC541-7B7A-43D3-8B79-37D633B846F1}">
-                                <asvg:svgBlip xmlns:asvg="http://schemas.microsoft.com/office/drawing/2016/SVG/main" r:embed="rId47"/>
+                                <asvg:svgBlip xmlns:asvg="http://schemas.microsoft.com/office/drawing/2016/SVG/main" r:embed="rId51"/>
                               </a:ext>
                             </a:extLst>
                           </a:blip>
@@ -4293,13 +4535,13 @@
                           <pic:cNvPicPr/>
                         </pic:nvPicPr>
                         <pic:blipFill>
-                          <a:blip r:embed="rId48">
+                          <a:blip r:embed="rId52">
                             <a:extLst>
                               <a:ext uri="{28A0092B-C50C-407E-A947-70E740481C1C}">
                                 <a14:useLocalDpi xmlns:a14="http://schemas.microsoft.com/office/drawing/2010/main" val="0"/>
                               </a:ext>
                               <a:ext uri="{96DAC541-7B7A-43D3-8B79-37D633B846F1}">
-                                <asvg:svgBlip xmlns:asvg="http://schemas.microsoft.com/office/drawing/2016/SVG/main" r:embed="rId49"/>
+                                <asvg:svgBlip xmlns:asvg="http://schemas.microsoft.com/office/drawing/2016/SVG/main" r:embed="rId53"/>
                               </a:ext>
                             </a:extLst>
                           </a:blip>
@@ -4360,13 +4602,13 @@
                           <pic:cNvPicPr/>
                         </pic:nvPicPr>
                         <pic:blipFill>
-                          <a:blip r:embed="rId50">
+                          <a:blip r:embed="rId54">
                             <a:extLst>
                               <a:ext uri="{28A0092B-C50C-407E-A947-70E740481C1C}">
                                 <a14:useLocalDpi xmlns:a14="http://schemas.microsoft.com/office/drawing/2010/main" val="0"/>
                               </a:ext>
                               <a:ext uri="{96DAC541-7B7A-43D3-8B79-37D633B846F1}">
-                                <asvg:svgBlip xmlns:asvg="http://schemas.microsoft.com/office/drawing/2016/SVG/main" r:embed="rId51"/>
+                                <asvg:svgBlip xmlns:asvg="http://schemas.microsoft.com/office/drawing/2016/SVG/main" r:embed="rId55"/>
                               </a:ext>
                             </a:extLst>
                           </a:blip>
@@ -4397,511 +4639,6 @@
     <w:p>
       <w:pPr>
         <w:pStyle w:val="Titre1"/>
-      </w:pPr>
-      <w:r>
-        <w:lastRenderedPageBreak/>
-        <w:t>I</w:t>
-      </w:r>
-      <w:r>
-        <w:t>II</w:t>
-      </w:r>
-      <w:r>
-        <w:t xml:space="preserve"> – </w:t>
-      </w:r>
-      <w:r>
-        <w:t>Mesure et construction</w:t>
-      </w:r>
-      <w:r>
-        <w:rPr>
-          <w:rFonts w:ascii="Times New Roman" w:hAnsi="Times New Roman"/>
-        </w:rPr>
-        <w:t xml:space="preserve"> </w:t>
-      </w:r>
-      <w:r>
-        <w:t>:</w:t>
-      </w:r>
-    </w:p>
-    <w:p>
-      <w:pPr>
-        <w:pStyle w:val="Titre2"/>
-        <w:numPr>
-          <w:ilvl w:val="0"/>
-          <w:numId w:val="15"/>
-        </w:numPr>
-      </w:pPr>
-      <w:r>
-        <w:t>Mesure d’un angle :</w:t>
-      </w:r>
-    </w:p>
-    <w:p>
-      <w:pPr>
-        <w:spacing w:before="100" w:beforeAutospacing="1" w:after="100" w:afterAutospacing="1" w:line="240" w:lineRule="auto"/>
-      </w:pPr>
-      <w:r>
-        <w:t>Lorsque l'on souhaite mesure un angle, on place le centre du rapporteur sur le sommet de l'angle ; On aligne l'un des 0° avec l'un des côtés de l'angle et on mesure à partir de la position de la seconde demi-droite.</w:t>
-      </w:r>
-    </w:p>
-    <w:tbl>
-      <w:tblPr>
-        <w:tblStyle w:val="Grilledutableau"/>
-        <w:tblW w:w="0" w:type="auto"/>
-        <w:tblLook w:val="04A0" w:firstRow="1" w:lastRow="0" w:firstColumn="1" w:lastColumn="0" w:noHBand="0" w:noVBand="1"/>
-      </w:tblPr>
-      <w:tblGrid>
-        <w:gridCol w:w="4956"/>
-        <w:gridCol w:w="4957"/>
-      </w:tblGrid>
-      <w:tr>
-        <w:tc>
-          <w:tcPr>
-            <w:tcW w:w="4956" w:type="dxa"/>
-          </w:tcPr>
-          <w:p>
-            <w:pPr>
-              <w:spacing w:before="100" w:beforeAutospacing="1" w:after="100" w:afterAutospacing="1"/>
-              <w:rPr>
-                <w:sz w:val="24"/>
-                <w:szCs w:val="24"/>
-              </w:rPr>
-            </w:pPr>
-            <w:r>
-              <w:rPr>
-                <w:noProof/>
-                <w:sz w:val="24"/>
-                <w:szCs w:val="24"/>
-              </w:rPr>
-              <w:drawing>
-                <wp:inline distT="0" distB="0" distL="0" distR="0" wp14:anchorId="0A6C7CE2" wp14:editId="7EFFB267">
-                  <wp:extent cx="3060000" cy="2108800"/>
-                  <wp:effectExtent l="0" t="0" r="7620" b="6350"/>
-                  <wp:docPr id="38" name="Graphique 38"/>
-                  <wp:cNvGraphicFramePr>
-                    <a:graphicFrameLocks xmlns:a="http://schemas.openxmlformats.org/drawingml/2006/main" noChangeAspect="1"/>
-                  </wp:cNvGraphicFramePr>
-                  <a:graphic xmlns:a="http://schemas.openxmlformats.org/drawingml/2006/main">
-                    <a:graphicData uri="http://schemas.openxmlformats.org/drawingml/2006/picture">
-                      <pic:pic xmlns:pic="http://schemas.openxmlformats.org/drawingml/2006/picture">
-                        <pic:nvPicPr>
-                          <pic:cNvPr id="1" name=""/>
-                          <pic:cNvPicPr/>
-                        </pic:nvPicPr>
-                        <pic:blipFill>
-                          <a:blip r:embed="rId52">
-                            <a:extLst>
-                              <a:ext uri="{96DAC541-7B7A-43D3-8B79-37D633B846F1}">
-                                <asvg:svgBlip xmlns:asvg="http://schemas.microsoft.com/office/drawing/2016/SVG/main" r:embed="rId53"/>
-                              </a:ext>
-                            </a:extLst>
-                          </a:blip>
-                          <a:stretch>
-                            <a:fillRect/>
-                          </a:stretch>
-                        </pic:blipFill>
-                        <pic:spPr>
-                          <a:xfrm>
-                            <a:off x="0" y="0"/>
-                            <a:ext cx="3060000" cy="2108800"/>
-                          </a:xfrm>
-                          <a:prstGeom prst="rect">
-                            <a:avLst/>
-                          </a:prstGeom>
-                        </pic:spPr>
-                      </pic:pic>
-                    </a:graphicData>
-                  </a:graphic>
-                </wp:inline>
-              </w:drawing>
-            </w:r>
-          </w:p>
-        </w:tc>
-        <w:tc>
-          <w:tcPr>
-            <w:tcW w:w="4957" w:type="dxa"/>
-          </w:tcPr>
-          <w:p>
-            <w:pPr>
-              <w:spacing w:before="100" w:beforeAutospacing="1" w:after="100" w:afterAutospacing="1"/>
-              <w:rPr>
-                <w:sz w:val="24"/>
-                <w:szCs w:val="24"/>
-              </w:rPr>
-            </w:pPr>
-            <w:r>
-              <w:rPr>
-                <w:rFonts w:eastAsia="Times New Roman" w:cs="Times New Roman"/>
-                <w:noProof/>
-                <w:sz w:val="28"/>
-                <w:szCs w:val="28"/>
-                <w:lang w:eastAsia="fr-FR"/>
-              </w:rPr>
-              <w:drawing>
-                <wp:inline distT="0" distB="0" distL="0" distR="0" wp14:anchorId="326C247C" wp14:editId="79C087AE">
-                  <wp:extent cx="3060000" cy="1803695"/>
-                  <wp:effectExtent l="0" t="0" r="7620" b="6350"/>
-                  <wp:docPr id="39" name="Graphique 39"/>
-                  <wp:cNvGraphicFramePr>
-                    <a:graphicFrameLocks xmlns:a="http://schemas.openxmlformats.org/drawingml/2006/main" noChangeAspect="1"/>
-                  </wp:cNvGraphicFramePr>
-                  <a:graphic xmlns:a="http://schemas.openxmlformats.org/drawingml/2006/main">
-                    <a:graphicData uri="http://schemas.openxmlformats.org/drawingml/2006/picture">
-                      <pic:pic xmlns:pic="http://schemas.openxmlformats.org/drawingml/2006/picture">
-                        <pic:nvPicPr>
-                          <pic:cNvPr id="1" name=""/>
-                          <pic:cNvPicPr/>
-                        </pic:nvPicPr>
-                        <pic:blipFill>
-                          <a:blip r:embed="rId54">
-                            <a:extLst>
-                              <a:ext uri="{96DAC541-7B7A-43D3-8B79-37D633B846F1}">
-                                <asvg:svgBlip xmlns:asvg="http://schemas.microsoft.com/office/drawing/2016/SVG/main" r:embed="rId55"/>
-                              </a:ext>
-                            </a:extLst>
-                          </a:blip>
-                          <a:stretch>
-                            <a:fillRect/>
-                          </a:stretch>
-                        </pic:blipFill>
-                        <pic:spPr>
-                          <a:xfrm>
-                            <a:off x="0" y="0"/>
-                            <a:ext cx="3060000" cy="1803695"/>
-                          </a:xfrm>
-                          <a:prstGeom prst="rect">
-                            <a:avLst/>
-                          </a:prstGeom>
-                        </pic:spPr>
-                      </pic:pic>
-                    </a:graphicData>
-                  </a:graphic>
-                </wp:inline>
-              </w:drawing>
-            </w:r>
-          </w:p>
-        </w:tc>
-      </w:tr>
-    </w:tbl>
-    <w:p>
-      <w:pPr>
-        <w:spacing w:before="100" w:beforeAutospacing="1" w:after="100" w:afterAutospacing="1" w:line="240" w:lineRule="auto"/>
-        <w:rPr>
-          <w:sz w:val="24"/>
-          <w:szCs w:val="24"/>
-        </w:rPr>
-      </w:pPr>
-      <w:r>
-        <w:t>En fonction du 0° choisi, la mesure de l'angle se mesure avec les graduations à l'intérieur ou à l'extérieur du rapporteur.</w:t>
-      </w:r>
-    </w:p>
-    <w:p>
-      <w:pPr>
-        <w:pStyle w:val="Titre2"/>
-      </w:pPr>
-      <w:r>
-        <w:t>Construction d’un angle :</w:t>
-      </w:r>
-    </w:p>
-    <w:tbl>
-      <w:tblPr>
-        <w:tblStyle w:val="Grilledutableau"/>
-        <w:tblW w:w="0" w:type="auto"/>
-        <w:tblLook w:val="04A0" w:firstRow="1" w:lastRow="0" w:firstColumn="1" w:lastColumn="0" w:noHBand="0" w:noVBand="1"/>
-      </w:tblPr>
-      <w:tblGrid>
-        <w:gridCol w:w="4938"/>
-        <w:gridCol w:w="4939"/>
-      </w:tblGrid>
-      <w:tr>
-        <w:tc>
-          <w:tcPr>
-            <w:tcW w:w="4956" w:type="dxa"/>
-            <w:tcBorders>
-              <w:top w:val="single" w:sz="18" w:space="0" w:color="auto"/>
-              <w:left w:val="single" w:sz="18" w:space="0" w:color="auto"/>
-              <w:right w:val="single" w:sz="18" w:space="0" w:color="auto"/>
-            </w:tcBorders>
-          </w:tcPr>
-          <w:p>
-            <w:pPr>
-              <w:pStyle w:val="Paragraphedeliste"/>
-              <w:numPr>
-                <w:ilvl w:val="0"/>
-                <w:numId w:val="25"/>
-              </w:numPr>
-              <w:spacing w:before="100" w:beforeAutospacing="1"/>
-              <w:ind w:left="449"/>
-              <w:rPr>
-                <w:sz w:val="24"/>
-                <w:szCs w:val="24"/>
-              </w:rPr>
-            </w:pPr>
-            <w:r>
-              <w:t>On place le rapporteur sur le sommet.</w:t>
-            </w:r>
-          </w:p>
-        </w:tc>
-        <w:tc>
-          <w:tcPr>
-            <w:tcW w:w="4957" w:type="dxa"/>
-            <w:tcBorders>
-              <w:top w:val="single" w:sz="18" w:space="0" w:color="auto"/>
-              <w:left w:val="single" w:sz="18" w:space="0" w:color="auto"/>
-              <w:right w:val="single" w:sz="18" w:space="0" w:color="auto"/>
-            </w:tcBorders>
-          </w:tcPr>
-          <w:p>
-            <w:pPr>
-              <w:pStyle w:val="Paragraphedeliste"/>
-              <w:numPr>
-                <w:ilvl w:val="0"/>
-                <w:numId w:val="25"/>
-              </w:numPr>
-              <w:spacing w:before="100" w:beforeAutospacing="1"/>
-              <w:ind w:left="458"/>
-              <w:rPr>
-                <w:sz w:val="24"/>
-                <w:szCs w:val="24"/>
-              </w:rPr>
-            </w:pPr>
-            <w:r>
-              <w:t>On aligne le rapporteur avec la demi-droite et on mesure 70° à partir du 0° aligné avec la demi-droite.</w:t>
-            </w:r>
-          </w:p>
-        </w:tc>
-      </w:tr>
-      <w:tr>
-        <w:trPr>
-          <w:trHeight w:val="3415"/>
-        </w:trPr>
-        <w:tc>
-          <w:tcPr>
-            <w:tcW w:w="4956" w:type="dxa"/>
-            <w:tcBorders>
-              <w:left w:val="single" w:sz="18" w:space="0" w:color="auto"/>
-              <w:bottom w:val="single" w:sz="18" w:space="0" w:color="auto"/>
-              <w:right w:val="single" w:sz="18" w:space="0" w:color="auto"/>
-            </w:tcBorders>
-            <w:vAlign w:val="center"/>
-          </w:tcPr>
-          <w:p>
-            <w:pPr>
-              <w:jc w:val="center"/>
-            </w:pPr>
-            <w:r>
-              <w:rPr>
-                <w:noProof/>
-                <w:sz w:val="24"/>
-                <w:szCs w:val="24"/>
-              </w:rPr>
-              <w:drawing>
-                <wp:inline distT="0" distB="0" distL="0" distR="0" wp14:anchorId="6A2207DC" wp14:editId="36946142">
-                  <wp:extent cx="2988000" cy="1571850"/>
-                  <wp:effectExtent l="0" t="0" r="3175" b="9525"/>
-                  <wp:docPr id="41" name="Graphique 41"/>
-                  <wp:cNvGraphicFramePr>
-                    <a:graphicFrameLocks xmlns:a="http://schemas.openxmlformats.org/drawingml/2006/main" noChangeAspect="1"/>
-                  </wp:cNvGraphicFramePr>
-                  <a:graphic xmlns:a="http://schemas.openxmlformats.org/drawingml/2006/main">
-                    <a:graphicData uri="http://schemas.openxmlformats.org/drawingml/2006/picture">
-                      <pic:pic xmlns:pic="http://schemas.openxmlformats.org/drawingml/2006/picture">
-                        <pic:nvPicPr>
-                          <pic:cNvPr id="1" name=""/>
-                          <pic:cNvPicPr/>
-                        </pic:nvPicPr>
-                        <pic:blipFill>
-                          <a:blip r:embed="rId56">
-                            <a:extLst>
-                              <a:ext uri="{96DAC541-7B7A-43D3-8B79-37D633B846F1}">
-                                <asvg:svgBlip xmlns:asvg="http://schemas.microsoft.com/office/drawing/2016/SVG/main" r:embed="rId57"/>
-                              </a:ext>
-                            </a:extLst>
-                          </a:blip>
-                          <a:stretch>
-                            <a:fillRect/>
-                          </a:stretch>
-                        </pic:blipFill>
-                        <pic:spPr>
-                          <a:xfrm>
-                            <a:off x="0" y="0"/>
-                            <a:ext cx="2988000" cy="1571850"/>
-                          </a:xfrm>
-                          <a:prstGeom prst="rect">
-                            <a:avLst/>
-                          </a:prstGeom>
-                        </pic:spPr>
-                      </pic:pic>
-                    </a:graphicData>
-                  </a:graphic>
-                </wp:inline>
-              </w:drawing>
-            </w:r>
-          </w:p>
-        </w:tc>
-        <w:tc>
-          <w:tcPr>
-            <w:tcW w:w="4957" w:type="dxa"/>
-            <w:tcBorders>
-              <w:left w:val="single" w:sz="18" w:space="0" w:color="auto"/>
-              <w:bottom w:val="single" w:sz="18" w:space="0" w:color="auto"/>
-              <w:right w:val="single" w:sz="18" w:space="0" w:color="auto"/>
-            </w:tcBorders>
-            <w:vAlign w:val="center"/>
-          </w:tcPr>
-          <w:p>
-            <w:pPr>
-              <w:jc w:val="center"/>
-            </w:pPr>
-            <w:r>
-              <w:rPr>
-                <w:noProof/>
-              </w:rPr>
-              <w:drawing>
-                <wp:inline distT="0" distB="0" distL="0" distR="0" wp14:anchorId="7563EEC0" wp14:editId="15CB2A6C">
-                  <wp:extent cx="2988000" cy="1981256"/>
-                  <wp:effectExtent l="0" t="0" r="3175" b="0"/>
-                  <wp:docPr id="42" name="Graphique 42"/>
-                  <wp:cNvGraphicFramePr>
-                    <a:graphicFrameLocks xmlns:a="http://schemas.openxmlformats.org/drawingml/2006/main" noChangeAspect="1"/>
-                  </wp:cNvGraphicFramePr>
-                  <a:graphic xmlns:a="http://schemas.openxmlformats.org/drawingml/2006/main">
-                    <a:graphicData uri="http://schemas.openxmlformats.org/drawingml/2006/picture">
-                      <pic:pic xmlns:pic="http://schemas.openxmlformats.org/drawingml/2006/picture">
-                        <pic:nvPicPr>
-                          <pic:cNvPr id="1" name=""/>
-                          <pic:cNvPicPr/>
-                        </pic:nvPicPr>
-                        <pic:blipFill>
-                          <a:blip r:embed="rId58">
-                            <a:extLst>
-                              <a:ext uri="{96DAC541-7B7A-43D3-8B79-37D633B846F1}">
-                                <asvg:svgBlip xmlns:asvg="http://schemas.microsoft.com/office/drawing/2016/SVG/main" r:embed="rId59"/>
-                              </a:ext>
-                            </a:extLst>
-                          </a:blip>
-                          <a:stretch>
-                            <a:fillRect/>
-                          </a:stretch>
-                        </pic:blipFill>
-                        <pic:spPr>
-                          <a:xfrm>
-                            <a:off x="0" y="0"/>
-                            <a:ext cx="2988000" cy="1981256"/>
-                          </a:xfrm>
-                          <a:prstGeom prst="rect">
-                            <a:avLst/>
-                          </a:prstGeom>
-                        </pic:spPr>
-                      </pic:pic>
-                    </a:graphicData>
-                  </a:graphic>
-                </wp:inline>
-              </w:drawing>
-            </w:r>
-          </w:p>
-        </w:tc>
-      </w:tr>
-      <w:tr>
-        <w:trPr>
-          <w:trHeight w:val="3226"/>
-        </w:trPr>
-        <w:tc>
-          <w:tcPr>
-            <w:tcW w:w="4956" w:type="dxa"/>
-            <w:tcBorders>
-              <w:top w:val="single" w:sz="18" w:space="0" w:color="auto"/>
-              <w:left w:val="single" w:sz="18" w:space="0" w:color="auto"/>
-              <w:bottom w:val="single" w:sz="18" w:space="0" w:color="auto"/>
-            </w:tcBorders>
-            <w:vAlign w:val="center"/>
-          </w:tcPr>
-          <w:p>
-            <w:pPr>
-              <w:pStyle w:val="Paragraphedeliste"/>
-              <w:numPr>
-                <w:ilvl w:val="0"/>
-                <w:numId w:val="25"/>
-              </w:numPr>
-              <w:spacing w:before="100" w:beforeAutospacing="1"/>
-              <w:ind w:left="449"/>
-              <w:rPr>
-                <w:sz w:val="24"/>
-                <w:szCs w:val="24"/>
-              </w:rPr>
-            </w:pPr>
-            <w:r>
-              <w:t>On trace la demi droite.</w:t>
-            </w:r>
-          </w:p>
-        </w:tc>
-        <w:tc>
-          <w:tcPr>
-            <w:tcW w:w="4957" w:type="dxa"/>
-            <w:tcBorders>
-              <w:top w:val="single" w:sz="18" w:space="0" w:color="auto"/>
-              <w:bottom w:val="single" w:sz="18" w:space="0" w:color="auto"/>
-              <w:right w:val="single" w:sz="18" w:space="0" w:color="auto"/>
-            </w:tcBorders>
-            <w:vAlign w:val="center"/>
-          </w:tcPr>
-          <w:p>
-            <w:pPr>
-              <w:jc w:val="center"/>
-              <w:rPr>
-                <w:noProof/>
-              </w:rPr>
-            </w:pPr>
-            <w:r>
-              <w:rPr>
-                <w:noProof/>
-              </w:rPr>
-              <w:drawing>
-                <wp:inline distT="0" distB="0" distL="0" distR="0" wp14:anchorId="2E272FA7" wp14:editId="305BD8E9">
-                  <wp:extent cx="2066925" cy="1828800"/>
-                  <wp:effectExtent l="0" t="0" r="9525" b="0"/>
-                  <wp:docPr id="43" name="Graphique 43"/>
-                  <wp:cNvGraphicFramePr>
-                    <a:graphicFrameLocks xmlns:a="http://schemas.openxmlformats.org/drawingml/2006/main" noChangeAspect="1"/>
-                  </wp:cNvGraphicFramePr>
-                  <a:graphic xmlns:a="http://schemas.openxmlformats.org/drawingml/2006/main">
-                    <a:graphicData uri="http://schemas.openxmlformats.org/drawingml/2006/picture">
-                      <pic:pic xmlns:pic="http://schemas.openxmlformats.org/drawingml/2006/picture">
-                        <pic:nvPicPr>
-                          <pic:cNvPr id="1" name=""/>
-                          <pic:cNvPicPr/>
-                        </pic:nvPicPr>
-                        <pic:blipFill>
-                          <a:blip r:embed="rId60">
-                            <a:extLst>
-                              <a:ext uri="{96DAC541-7B7A-43D3-8B79-37D633B846F1}">
-                                <asvg:svgBlip xmlns:asvg="http://schemas.microsoft.com/office/drawing/2016/SVG/main" r:embed="rId61"/>
-                              </a:ext>
-                            </a:extLst>
-                          </a:blip>
-                          <a:stretch>
-                            <a:fillRect/>
-                          </a:stretch>
-                        </pic:blipFill>
-                        <pic:spPr>
-                          <a:xfrm>
-                            <a:off x="0" y="0"/>
-                            <a:ext cx="2066925" cy="1828800"/>
-                          </a:xfrm>
-                          <a:prstGeom prst="rect">
-                            <a:avLst/>
-                          </a:prstGeom>
-                        </pic:spPr>
-                      </pic:pic>
-                    </a:graphicData>
-                  </a:graphic>
-                </wp:inline>
-              </w:drawing>
-            </w:r>
-          </w:p>
-        </w:tc>
-      </w:tr>
-    </w:tbl>
-    <w:p>
-      <w:pPr>
-        <w:pStyle w:val="Titre1"/>
         <w:rPr>
           <w:rStyle w:val="Accentuationlgre"/>
           <w:b w:val="0"/>
@@ -4911,9 +4648,9 @@
       </w:pPr>
     </w:p>
     <w:sectPr>
-      <w:footerReference w:type="default" r:id="rId62"/>
-      <w:headerReference w:type="first" r:id="rId63"/>
-      <w:footerReference w:type="first" r:id="rId64"/>
+      <w:footerReference w:type="default" r:id="rId56"/>
+      <w:headerReference w:type="first" r:id="rId57"/>
+      <w:footerReference w:type="first" r:id="rId58"/>
       <w:type w:val="continuous"/>
       <w:pgSz w:w="11906" w:h="16838"/>
       <w:pgMar w:top="420" w:right="849" w:bottom="426" w:left="1134" w:header="428" w:footer="123" w:gutter="0"/>

</xml_diff>